<commit_message>
docs: v1.1 — manuals reflect the apps front-door reality
Architecture, User and Operation manuals regenerated: served at
apps.p3mai.com/pmo behind the front door (APP_BASE=/pmo/ build arg),
legacy app.p3mai.com 301s there; CI (pytest+vitest) + Dependabot;
optional Sentry via SENTRY_DSN. Also ignore generator __pycache__.

Co-Authored-By: Claude Fable 5 <noreply@anthropic.com>
</commit_message>
<xml_diff>
--- a/docs/01_Architecture_and_Design.docx
+++ b/docs/01_Architecture_and_Design.docx
@@ -165,7 +165,7 @@
                 <w:color w:val="1C2B3A"/>
                 <w:sz w:val="22"/>
               </w:rPr>
-              <w:t>v1.0</w:t>
+              <w:t>v1.1</w:t>
             </w:r>
           </w:p>
         </w:tc>
@@ -201,7 +201,7 @@
                 <w:color w:val="1C2B3A"/>
                 <w:sz w:val="22"/>
               </w:rPr>
-              <w:t>1 August 2026</w:t>
+              <w:t>6 August 2026</w:t>
             </w:r>
           </w:p>
         </w:tc>
@@ -492,6 +492,76 @@
           </w:p>
         </w:tc>
       </w:tr>
+      <w:tr>
+        <w:tc>
+          <w:tcPr>
+            <w:tcW w:type="dxa" w:w="2353"/>
+          </w:tcPr>
+          <w:p>
+            <w:r>
+              <w:rPr>
+                <w:rFonts w:ascii="Segoe UI" w:hAnsi="Segoe UI" w:cs="Segoe UI"/>
+                <w:b w:val="0"/>
+                <w:i w:val="0"/>
+                <w:color w:val="1C2B3A"/>
+                <w:sz w:val="20"/>
+              </w:rPr>
+              <w:t>v1.1</w:t>
+            </w:r>
+          </w:p>
+        </w:tc>
+        <w:tc>
+          <w:tcPr>
+            <w:tcW w:type="dxa" w:w="2353"/>
+          </w:tcPr>
+          <w:p>
+            <w:r>
+              <w:rPr>
+                <w:rFonts w:ascii="Segoe UI" w:hAnsi="Segoe UI" w:cs="Segoe UI"/>
+                <w:b w:val="0"/>
+                <w:i w:val="0"/>
+                <w:color w:val="1C2B3A"/>
+                <w:sz w:val="20"/>
+              </w:rPr>
+              <w:t>2026-08-06</w:t>
+            </w:r>
+          </w:p>
+        </w:tc>
+        <w:tc>
+          <w:tcPr>
+            <w:tcW w:type="dxa" w:w="2353"/>
+          </w:tcPr>
+          <w:p>
+            <w:r>
+              <w:rPr>
+                <w:rFonts w:ascii="Segoe UI" w:hAnsi="Segoe UI" w:cs="Segoe UI"/>
+                <w:b w:val="0"/>
+                <w:i w:val="0"/>
+                <w:color w:val="1C2B3A"/>
+                <w:sz w:val="20"/>
+              </w:rPr>
+              <w:t>Douglas Colvin</w:t>
+            </w:r>
+          </w:p>
+        </w:tc>
+        <w:tc>
+          <w:tcPr>
+            <w:tcW w:type="dxa" w:w="2353"/>
+          </w:tcPr>
+          <w:p>
+            <w:r>
+              <w:rPr>
+                <w:rFonts w:ascii="Segoe UI" w:hAnsi="Segoe UI" w:cs="Segoe UI"/>
+                <w:b w:val="0"/>
+                <w:i w:val="0"/>
+                <w:color w:val="1C2B3A"/>
+                <w:sz w:val="20"/>
+              </w:rPr>
+              <w:t>Front-door move: served at apps.p3mai.com/pmo (APP_BASE=/pmo/), legacy app.p3mai.com 301s; CI + Dependabot; optional Sentry</w:t>
+            </w:r>
+          </w:p>
+        </w:tc>
+      </w:tr>
     </w:tbl>
     <w:p/>
     <w:p>
@@ -713,7 +783,7 @@
           <w:color w:val="1C2B3A"/>
           <w:sz w:val="22"/>
         </w:rPr>
-        <w:t xml:space="preserve">It is deployed as a Docker container on Render at </w:t>
+        <w:t xml:space="preserve">It is deployed as a Docker container on Render, served at </w:t>
       </w:r>
       <w:r>
         <w:rPr>
@@ -723,7 +793,7 @@
           <w:color w:val="1C2B3A"/>
           <w:sz w:val="22"/>
         </w:rPr>
-        <w:t>app.p3mai.com</w:t>
+        <w:t>apps.p3mai.com/pmo</w:t>
       </w:r>
       <w:r>
         <w:rPr>
@@ -733,7 +803,7 @@
           <w:color w:val="1C2B3A"/>
           <w:sz w:val="22"/>
         </w:rPr>
-        <w:t xml:space="preserve">. Version 1 has </w:t>
+        <w:t xml:space="preserve"> behind the apps.p3mai.com front door (legacy app.p3mai.com 301-redirects there). Version 1 has </w:t>
       </w:r>
       <w:r>
         <w:rPr>
@@ -3360,7 +3430,7 @@
                 <w:color w:val="1C2B3A"/>
                 <w:sz w:val="20"/>
               </w:rPr>
-              <w:t>The app has no login and is deployed openly at app.p3mai.com — a deliberate choice for a single-user tool holding non-sensitive demo/working data. Add authentication before it holds anything sensitive.</w:t>
+              <w:t>The app has no login and is deployed openly at apps.p3mai.com/pmo — a deliberate choice for a single-user tool holding non-sensitive demo/working data. Add authentication before it holds anything sensitive.</w:t>
             </w:r>
           </w:p>
         </w:tc>
@@ -3381,6 +3451,98 @@
           <w:sz w:val="32"/>
         </w:rPr>
         <w:t>11.  Deployment architecture</w:t>
+      </w:r>
+    </w:p>
+    <w:p>
+      <w:r>
+        <w:rPr>
+          <w:rFonts w:ascii="Segoe UI" w:hAnsi="Segoe UI" w:cs="Segoe UI"/>
+          <w:b w:val="0"/>
+          <w:i w:val="0"/>
+          <w:color w:val="1C2B3A"/>
+          <w:sz w:val="22"/>
+        </w:rPr>
+        <w:t xml:space="preserve">The SPA is built with a </w:t>
+      </w:r>
+      <w:r>
+        <w:rPr>
+          <w:rFonts w:ascii="Segoe UI" w:hAnsi="Segoe UI" w:cs="Segoe UI"/>
+          <w:b/>
+          <w:i w:val="0"/>
+          <w:color w:val="1C2B3A"/>
+          <w:sz w:val="22"/>
+        </w:rPr>
+        <w:t>base path of /pmo/</w:t>
+      </w:r>
+      <w:r>
+        <w:rPr>
+          <w:rFonts w:ascii="Segoe UI" w:hAnsi="Segoe UI" w:cs="Segoe UI"/>
+          <w:b w:val="0"/>
+          <w:i w:val="0"/>
+          <w:color w:val="1C2B3A"/>
+          <w:sz w:val="22"/>
+        </w:rPr>
+        <w:t xml:space="preserve"> (Docker build arg </w:t>
+      </w:r>
+      <w:r>
+        <w:rPr>
+          <w:rFonts w:ascii="Consolas" w:hAnsi="Consolas" w:cs="Consolas"/>
+          <w:b w:val="0"/>
+          <w:i w:val="0"/>
+          <w:color w:val="1B3F6E"/>
+          <w:sz w:val="21"/>
+        </w:rPr>
+        <w:t>APP_BASE</w:t>
+      </w:r>
+      <w:r>
+        <w:rPr>
+          <w:rFonts w:ascii="Segoe UI" w:hAnsi="Segoe UI" w:cs="Segoe UI"/>
+          <w:b w:val="0"/>
+          <w:i w:val="0"/>
+          <w:color w:val="1C2B3A"/>
+          <w:sz w:val="22"/>
+        </w:rPr>
+        <w:t>, defaulting to /pmo/) so the whole app serves correctly behind the front door; backend middleware 301-redirects the legacy app.p3mai.com domain to apps.p3mai.com/pmo. CI (</w:t>
+      </w:r>
+      <w:r>
+        <w:rPr>
+          <w:rFonts w:ascii="Consolas" w:hAnsi="Consolas" w:cs="Consolas"/>
+          <w:b w:val="0"/>
+          <w:i w:val="0"/>
+          <w:color w:val="1B3F6E"/>
+          <w:sz w:val="21"/>
+        </w:rPr>
+        <w:t>ci.yml</w:t>
+      </w:r>
+      <w:r>
+        <w:rPr>
+          <w:rFonts w:ascii="Segoe UI" w:hAnsi="Segoe UI" w:cs="Segoe UI"/>
+          <w:b w:val="0"/>
+          <w:i w:val="0"/>
+          <w:color w:val="1C2B3A"/>
+          <w:sz w:val="22"/>
+        </w:rPr>
+        <w:t xml:space="preserve">: pytest + vitest) and Dependabot run on the repository; optional Sentry error tracking activates when </w:t>
+      </w:r>
+      <w:r>
+        <w:rPr>
+          <w:rFonts w:ascii="Consolas" w:hAnsi="Consolas" w:cs="Consolas"/>
+          <w:b w:val="0"/>
+          <w:i w:val="0"/>
+          <w:color w:val="1B3F6E"/>
+          <w:sz w:val="21"/>
+        </w:rPr>
+        <w:t>SENTRY_DSN</w:t>
+      </w:r>
+      <w:r>
+        <w:rPr>
+          <w:rFonts w:ascii="Segoe UI" w:hAnsi="Segoe UI" w:cs="Segoe UI"/>
+          <w:b w:val="0"/>
+          <w:i w:val="0"/>
+          <w:color w:val="1C2B3A"/>
+          <w:sz w:val="22"/>
+        </w:rPr>
+        <w:t xml:space="preserve"> is set. </w:t>
       </w:r>
     </w:p>
     <w:p>
@@ -3568,7 +3730,7 @@
                 <w:color w:val="1C2B3A"/>
                 <w:sz w:val="19"/>
               </w:rPr>
-              <w:t>app.p3mai.com (Render: pmo-service.onrender.com)</w:t>
+              <w:t>apps.p3mai.com/pmo (behind the apps front door; origin pmo-service.onrender.com)</w:t>
             </w:r>
           </w:p>
         </w:tc>
@@ -4144,7 +4306,7 @@
         <w:sz w:val="16"/>
       </w:rPr>
       <w:tab/>
-      <w:t>v1.0</w:t>
+      <w:t>v1.1</w:t>
       <w:tab/>
     </w:r>
     <w:r>

</xml_diff>